<commit_message>
chore: regenerate CVs and cover letters
</commit_message>
<xml_diff>
--- a/public/resume/Isaac_Adjei_CV.docx
+++ b/public/resume/Isaac_Adjei_CV.docx
@@ -33,7 +33,7 @@
         </w:rPr>
         <w:t xml:space="preserve">✉ </w:t>
       </w:r>
-      <w:hyperlink w:history="1" r:id="rIdoe4izdh4anakqhfiphflb">
+      <w:hyperlink w:history="1" r:id="rId40hk7_trhblvslp19dufm">
         <w:r>
           <w:rPr>
             <w:rFonts w:ascii="Calibri" w:cs="Calibri" w:eastAsia="Calibri" w:hAnsi="Calibri"/>
@@ -63,7 +63,7 @@
         </w:rPr>
         <w:t xml:space="preserve">• </w:t>
       </w:r>
-      <w:hyperlink w:history="1" r:id="rIdwawzlbjzn2dacticwzy0f">
+      <w:hyperlink w:history="1" r:id="rIdv2esja9wedwoih6msqqwl">
         <w:r>
           <w:rPr>
             <w:rFonts w:ascii="Calibri" w:cs="Calibri" w:eastAsia="Calibri" w:hAnsi="Calibri"/>
@@ -93,7 +93,7 @@
         </w:rPr>
         <w:t xml:space="preserve">⁠in </w:t>
       </w:r>
-      <w:hyperlink w:history="1" r:id="rIdj5pipxgjfufedf8vthhyk">
+      <w:hyperlink w:history="1" r:id="rIdbkeduznkanv3mfn_fbnzj">
         <w:r>
           <w:rPr>
             <w:rFonts w:ascii="Calibri" w:cs="Calibri" w:eastAsia="Calibri" w:hAnsi="Calibri"/>
@@ -123,7 +123,7 @@
         </w:rPr>
         <w:t xml:space="preserve">◔ </w:t>
       </w:r>
-      <w:hyperlink w:history="1" r:id="rIdhi1zrf1nhblzo9qltkw_s">
+      <w:hyperlink w:history="1" r:id="rIdy6t9tvuvl4jeaaut_eded">
         <w:r>
           <w:rPr>
             <w:rFonts w:ascii="Calibri" w:cs="Calibri" w:eastAsia="Calibri" w:hAnsi="Calibri"/>
@@ -153,7 +153,7 @@
         </w:rPr>
         <w:t xml:space="preserve">Ⓘ </w:t>
       </w:r>
-      <w:hyperlink w:history="1" r:id="rIdnd6hokoionihstqtyxf5l">
+      <w:hyperlink w:history="1" r:id="rIdrnl-vwjruczqrg_1b3byd">
         <w:r>
           <w:rPr>
             <w:rFonts w:ascii="Calibri" w:cs="Calibri" w:eastAsia="Calibri" w:hAnsi="Calibri"/>
@@ -716,7 +716,7 @@
         </w:rPr>
         <w:t xml:space="preserve">   </w:t>
       </w:r>
-      <w:hyperlink w:history="1" r:id="rIdrzqjglgm8mv5mbnrjfkfu">
+      <w:hyperlink w:history="1" r:id="rIdlnu4nnreolbngmd7jc2ow">
         <w:r>
           <w:rPr>
             <w:rFonts w:ascii="Calibri" w:cs="Calibri" w:eastAsia="Calibri" w:hAnsi="Calibri"/>
@@ -744,7 +744,7 @@
         </w:rPr>
         <w:t xml:space="preserve">| </w:t>
       </w:r>
-      <w:hyperlink w:history="1" r:id="rIdd8ciebfqfxn-cvdatzefk">
+      <w:hyperlink w:history="1" r:id="rId_prmewq3lydc-attca19w">
         <w:r>
           <w:rPr>
             <w:rFonts w:ascii="Calibri" w:cs="Calibri" w:eastAsia="Calibri" w:hAnsi="Calibri"/>
@@ -772,7 +772,7 @@
         </w:rPr>
         <w:t xml:space="preserve">| </w:t>
       </w:r>
-      <w:hyperlink w:history="1" r:id="rIdxh37se1cdg7bd8dnj9iqd">
+      <w:hyperlink w:history="1" r:id="rIdnb0stktm6o5sdovrxv7bb">
         <w:r>
           <w:rPr>
             <w:rFonts w:ascii="Calibri" w:cs="Calibri" w:eastAsia="Calibri" w:hAnsi="Calibri"/>
@@ -1125,7 +1125,7 @@
         </w:rPr>
         <w:t xml:space="preserve">   </w:t>
       </w:r>
-      <w:hyperlink w:history="1" r:id="rIdbikupdrdeq2t5qjq5a9ur">
+      <w:hyperlink w:history="1" r:id="rId_j7w48iegxrm-fhscu-qw">
         <w:r>
           <w:rPr>
             <w:rFonts w:ascii="Calibri" w:cs="Calibri" w:eastAsia="Calibri" w:hAnsi="Calibri"/>
@@ -1275,7 +1275,7 @@
         </w:rPr>
         <w:t xml:space="preserve">   </w:t>
       </w:r>
-      <w:hyperlink w:history="1" r:id="rId7z8mrv4ef59pucllhoqtb">
+      <w:hyperlink w:history="1" r:id="rIdrr-ciaba-c2hkf1fybnoc">
         <w:r>
           <w:rPr>
             <w:rFonts w:ascii="Calibri" w:cs="Calibri" w:eastAsia="Calibri" w:hAnsi="Calibri"/>
@@ -1303,7 +1303,7 @@
         </w:rPr>
         <w:t xml:space="preserve">| </w:t>
       </w:r>
-      <w:hyperlink w:history="1" r:id="rIdcvkc2tjz7f2memlqsmkix">
+      <w:hyperlink w:history="1" r:id="rIduyqgoiwkjrn6ou0ftgqvf">
         <w:r>
           <w:rPr>
             <w:rFonts w:ascii="Calibri" w:cs="Calibri" w:eastAsia="Calibri" w:hAnsi="Calibri"/>
@@ -1436,7 +1436,7 @@
         </w:rPr>
         <w:t xml:space="preserve">   </w:t>
       </w:r>
-      <w:hyperlink w:history="1" r:id="rId_ifff4jwimjadqwtiwfai">
+      <w:hyperlink w:history="1" r:id="rIdwastdpzht8w1l05s0xaob">
         <w:r>
           <w:rPr>
             <w:rFonts w:ascii="Calibri" w:cs="Calibri" w:eastAsia="Calibri" w:hAnsi="Calibri"/>
@@ -1464,7 +1464,7 @@
         </w:rPr>
         <w:t xml:space="preserve">| </w:t>
       </w:r>
-      <w:hyperlink w:history="1" r:id="rIdikw1ygiujwivofhun4yum">
+      <w:hyperlink w:history="1" r:id="rIdmqagkwqugvo-hpieoi82v">
         <w:r>
           <w:rPr>
             <w:rFonts w:ascii="Calibri" w:cs="Calibri" w:eastAsia="Calibri" w:hAnsi="Calibri"/>
@@ -1492,7 +1492,7 @@
         </w:rPr>
         <w:t xml:space="preserve">| </w:t>
       </w:r>
-      <w:hyperlink w:history="1" r:id="rId8wskudhnfr-zp16r_bfpx">
+      <w:hyperlink w:history="1" r:id="rIdgueaviqkwmfeydedefqox">
         <w:r>
           <w:rPr>
             <w:rFonts w:ascii="Calibri" w:cs="Calibri" w:eastAsia="Calibri" w:hAnsi="Calibri"/>
@@ -1659,7 +1659,7 @@
         </w:rPr>
         <w:t xml:space="preserve">   </w:t>
       </w:r>
-      <w:hyperlink w:history="1" r:id="rIdp3bxd6zyygodcjx7wicr6">
+      <w:hyperlink w:history="1" r:id="rIdtl9wxv3nvdkzzzuhzzisj">
         <w:r>
           <w:rPr>
             <w:rFonts w:ascii="Calibri" w:cs="Calibri" w:eastAsia="Calibri" w:hAnsi="Calibri"/>
@@ -1828,7 +1828,7 @@
         </w:rPr>
         <w:t xml:space="preserve">   </w:t>
       </w:r>
-      <w:hyperlink w:history="1" r:id="rIdqzzkl-6mg8cvj-hkactjs">
+      <w:hyperlink w:history="1" r:id="rIdbyc263d6gkk_d4ee4nkak">
         <w:r>
           <w:rPr>
             <w:rFonts w:ascii="Calibri" w:cs="Calibri" w:eastAsia="Calibri" w:hAnsi="Calibri"/>
@@ -1856,7 +1856,7 @@
         </w:rPr>
         <w:t xml:space="preserve">| </w:t>
       </w:r>
-      <w:hyperlink w:history="1" r:id="rIdhowgkjq26rndalq3jmpe5">
+      <w:hyperlink w:history="1" r:id="rIdmzmt1b6i81urfmp0dhhfp">
         <w:r>
           <w:rPr>
             <w:rFonts w:ascii="Calibri" w:cs="Calibri" w:eastAsia="Calibri" w:hAnsi="Calibri"/>
@@ -2802,7 +2802,7 @@
         </w:rPr>
         <w:t xml:space="preserve">   </w:t>
       </w:r>
-      <w:hyperlink w:history="1" r:id="rIdr1cnbiwnnr2acts4d4azz">
+      <w:hyperlink w:history="1" r:id="rIdelekrjszkirxdjdh8lppt">
         <w:r>
           <w:rPr>
             <w:rFonts w:ascii="Calibri" w:cs="Calibri" w:eastAsia="Calibri" w:hAnsi="Calibri"/>
@@ -2830,7 +2830,7 @@
         </w:rPr>
         <w:t xml:space="preserve">| </w:t>
       </w:r>
-      <w:hyperlink w:history="1" r:id="rIdefjpebfrvavog64mlpflv">
+      <w:hyperlink w:history="1" r:id="rId34qoxpi1mferwrbhr-8bj">
         <w:r>
           <w:rPr>
             <w:rFonts w:ascii="Calibri" w:cs="Calibri" w:eastAsia="Calibri" w:hAnsi="Calibri"/>

</xml_diff>

<commit_message>
chore: regenerate CVs and cover letters (#1027)
</commit_message>
<xml_diff>
--- a/public/resume/Isaac_Adjei_CV.docx
+++ b/public/resume/Isaac_Adjei_CV.docx
@@ -33,7 +33,7 @@
         </w:rPr>
         <w:t xml:space="preserve">✉ </w:t>
       </w:r>
-      <w:hyperlink w:history="1" r:id="rIdoe4izdh4anakqhfiphflb">
+      <w:hyperlink w:history="1" r:id="rId40hk7_trhblvslp19dufm">
         <w:r>
           <w:rPr>
             <w:rFonts w:ascii="Calibri" w:cs="Calibri" w:eastAsia="Calibri" w:hAnsi="Calibri"/>
@@ -63,7 +63,7 @@
         </w:rPr>
         <w:t xml:space="preserve">• </w:t>
       </w:r>
-      <w:hyperlink w:history="1" r:id="rIdwawzlbjzn2dacticwzy0f">
+      <w:hyperlink w:history="1" r:id="rIdv2esja9wedwoih6msqqwl">
         <w:r>
           <w:rPr>
             <w:rFonts w:ascii="Calibri" w:cs="Calibri" w:eastAsia="Calibri" w:hAnsi="Calibri"/>
@@ -93,7 +93,7 @@
         </w:rPr>
         <w:t xml:space="preserve">⁠in </w:t>
       </w:r>
-      <w:hyperlink w:history="1" r:id="rIdj5pipxgjfufedf8vthhyk">
+      <w:hyperlink w:history="1" r:id="rIdbkeduznkanv3mfn_fbnzj">
         <w:r>
           <w:rPr>
             <w:rFonts w:ascii="Calibri" w:cs="Calibri" w:eastAsia="Calibri" w:hAnsi="Calibri"/>
@@ -123,7 +123,7 @@
         </w:rPr>
         <w:t xml:space="preserve">◔ </w:t>
       </w:r>
-      <w:hyperlink w:history="1" r:id="rIdhi1zrf1nhblzo9qltkw_s">
+      <w:hyperlink w:history="1" r:id="rIdy6t9tvuvl4jeaaut_eded">
         <w:r>
           <w:rPr>
             <w:rFonts w:ascii="Calibri" w:cs="Calibri" w:eastAsia="Calibri" w:hAnsi="Calibri"/>
@@ -153,7 +153,7 @@
         </w:rPr>
         <w:t xml:space="preserve">Ⓘ </w:t>
       </w:r>
-      <w:hyperlink w:history="1" r:id="rIdnd6hokoionihstqtyxf5l">
+      <w:hyperlink w:history="1" r:id="rIdrnl-vwjruczqrg_1b3byd">
         <w:r>
           <w:rPr>
             <w:rFonts w:ascii="Calibri" w:cs="Calibri" w:eastAsia="Calibri" w:hAnsi="Calibri"/>
@@ -716,7 +716,7 @@
         </w:rPr>
         <w:t xml:space="preserve">   </w:t>
       </w:r>
-      <w:hyperlink w:history="1" r:id="rIdrzqjglgm8mv5mbnrjfkfu">
+      <w:hyperlink w:history="1" r:id="rIdlnu4nnreolbngmd7jc2ow">
         <w:r>
           <w:rPr>
             <w:rFonts w:ascii="Calibri" w:cs="Calibri" w:eastAsia="Calibri" w:hAnsi="Calibri"/>
@@ -744,7 +744,7 @@
         </w:rPr>
         <w:t xml:space="preserve">| </w:t>
       </w:r>
-      <w:hyperlink w:history="1" r:id="rIdd8ciebfqfxn-cvdatzefk">
+      <w:hyperlink w:history="1" r:id="rId_prmewq3lydc-attca19w">
         <w:r>
           <w:rPr>
             <w:rFonts w:ascii="Calibri" w:cs="Calibri" w:eastAsia="Calibri" w:hAnsi="Calibri"/>
@@ -772,7 +772,7 @@
         </w:rPr>
         <w:t xml:space="preserve">| </w:t>
       </w:r>
-      <w:hyperlink w:history="1" r:id="rIdxh37se1cdg7bd8dnj9iqd">
+      <w:hyperlink w:history="1" r:id="rIdnb0stktm6o5sdovrxv7bb">
         <w:r>
           <w:rPr>
             <w:rFonts w:ascii="Calibri" w:cs="Calibri" w:eastAsia="Calibri" w:hAnsi="Calibri"/>
@@ -1125,7 +1125,7 @@
         </w:rPr>
         <w:t xml:space="preserve">   </w:t>
       </w:r>
-      <w:hyperlink w:history="1" r:id="rIdbikupdrdeq2t5qjq5a9ur">
+      <w:hyperlink w:history="1" r:id="rId_j7w48iegxrm-fhscu-qw">
         <w:r>
           <w:rPr>
             <w:rFonts w:ascii="Calibri" w:cs="Calibri" w:eastAsia="Calibri" w:hAnsi="Calibri"/>
@@ -1275,7 +1275,7 @@
         </w:rPr>
         <w:t xml:space="preserve">   </w:t>
       </w:r>
-      <w:hyperlink w:history="1" r:id="rId7z8mrv4ef59pucllhoqtb">
+      <w:hyperlink w:history="1" r:id="rIdrr-ciaba-c2hkf1fybnoc">
         <w:r>
           <w:rPr>
             <w:rFonts w:ascii="Calibri" w:cs="Calibri" w:eastAsia="Calibri" w:hAnsi="Calibri"/>
@@ -1303,7 +1303,7 @@
         </w:rPr>
         <w:t xml:space="preserve">| </w:t>
       </w:r>
-      <w:hyperlink w:history="1" r:id="rIdcvkc2tjz7f2memlqsmkix">
+      <w:hyperlink w:history="1" r:id="rIduyqgoiwkjrn6ou0ftgqvf">
         <w:r>
           <w:rPr>
             <w:rFonts w:ascii="Calibri" w:cs="Calibri" w:eastAsia="Calibri" w:hAnsi="Calibri"/>
@@ -1436,7 +1436,7 @@
         </w:rPr>
         <w:t xml:space="preserve">   </w:t>
       </w:r>
-      <w:hyperlink w:history="1" r:id="rId_ifff4jwimjadqwtiwfai">
+      <w:hyperlink w:history="1" r:id="rIdwastdpzht8w1l05s0xaob">
         <w:r>
           <w:rPr>
             <w:rFonts w:ascii="Calibri" w:cs="Calibri" w:eastAsia="Calibri" w:hAnsi="Calibri"/>
@@ -1464,7 +1464,7 @@
         </w:rPr>
         <w:t xml:space="preserve">| </w:t>
       </w:r>
-      <w:hyperlink w:history="1" r:id="rIdikw1ygiujwivofhun4yum">
+      <w:hyperlink w:history="1" r:id="rIdmqagkwqugvo-hpieoi82v">
         <w:r>
           <w:rPr>
             <w:rFonts w:ascii="Calibri" w:cs="Calibri" w:eastAsia="Calibri" w:hAnsi="Calibri"/>
@@ -1492,7 +1492,7 @@
         </w:rPr>
         <w:t xml:space="preserve">| </w:t>
       </w:r>
-      <w:hyperlink w:history="1" r:id="rId8wskudhnfr-zp16r_bfpx">
+      <w:hyperlink w:history="1" r:id="rIdgueaviqkwmfeydedefqox">
         <w:r>
           <w:rPr>
             <w:rFonts w:ascii="Calibri" w:cs="Calibri" w:eastAsia="Calibri" w:hAnsi="Calibri"/>
@@ -1659,7 +1659,7 @@
         </w:rPr>
         <w:t xml:space="preserve">   </w:t>
       </w:r>
-      <w:hyperlink w:history="1" r:id="rIdp3bxd6zyygodcjx7wicr6">
+      <w:hyperlink w:history="1" r:id="rIdtl9wxv3nvdkzzzuhzzisj">
         <w:r>
           <w:rPr>
             <w:rFonts w:ascii="Calibri" w:cs="Calibri" w:eastAsia="Calibri" w:hAnsi="Calibri"/>
@@ -1828,7 +1828,7 @@
         </w:rPr>
         <w:t xml:space="preserve">   </w:t>
       </w:r>
-      <w:hyperlink w:history="1" r:id="rIdqzzkl-6mg8cvj-hkactjs">
+      <w:hyperlink w:history="1" r:id="rIdbyc263d6gkk_d4ee4nkak">
         <w:r>
           <w:rPr>
             <w:rFonts w:ascii="Calibri" w:cs="Calibri" w:eastAsia="Calibri" w:hAnsi="Calibri"/>
@@ -1856,7 +1856,7 @@
         </w:rPr>
         <w:t xml:space="preserve">| </w:t>
       </w:r>
-      <w:hyperlink w:history="1" r:id="rIdhowgkjq26rndalq3jmpe5">
+      <w:hyperlink w:history="1" r:id="rIdmzmt1b6i81urfmp0dhhfp">
         <w:r>
           <w:rPr>
             <w:rFonts w:ascii="Calibri" w:cs="Calibri" w:eastAsia="Calibri" w:hAnsi="Calibri"/>
@@ -2802,7 +2802,7 @@
         </w:rPr>
         <w:t xml:space="preserve">   </w:t>
       </w:r>
-      <w:hyperlink w:history="1" r:id="rIdr1cnbiwnnr2acts4d4azz">
+      <w:hyperlink w:history="1" r:id="rIdelekrjszkirxdjdh8lppt">
         <w:r>
           <w:rPr>
             <w:rFonts w:ascii="Calibri" w:cs="Calibri" w:eastAsia="Calibri" w:hAnsi="Calibri"/>
@@ -2830,7 +2830,7 @@
         </w:rPr>
         <w:t xml:space="preserve">| </w:t>
       </w:r>
-      <w:hyperlink w:history="1" r:id="rIdefjpebfrvavog64mlpflv">
+      <w:hyperlink w:history="1" r:id="rId34qoxpi1mferwrbhr-8bj">
         <w:r>
           <w:rPr>
             <w:rFonts w:ascii="Calibri" w:cs="Calibri" w:eastAsia="Calibri" w:hAnsi="Calibri"/>

</xml_diff>

<commit_message>
chore: regenerate CVs and cover letters (#1028)
</commit_message>
<xml_diff>
--- a/public/resume/Isaac_Adjei_CV.docx
+++ b/public/resume/Isaac_Adjei_CV.docx
@@ -33,7 +33,7 @@
         </w:rPr>
         <w:t xml:space="preserve">✉ </w:t>
       </w:r>
-      <w:hyperlink w:history="1" r:id="rId40hk7_trhblvslp19dufm">
+      <w:hyperlink w:history="1" r:id="rId-b3nf5ygigux5lrqvjzyk">
         <w:r>
           <w:rPr>
             <w:rFonts w:ascii="Calibri" w:cs="Calibri" w:eastAsia="Calibri" w:hAnsi="Calibri"/>
@@ -63,7 +63,7 @@
         </w:rPr>
         <w:t xml:space="preserve">• </w:t>
       </w:r>
-      <w:hyperlink w:history="1" r:id="rIdv2esja9wedwoih6msqqwl">
+      <w:hyperlink w:history="1" r:id="rIdnqj_gsai5dfgoc0afejlv">
         <w:r>
           <w:rPr>
             <w:rFonts w:ascii="Calibri" w:cs="Calibri" w:eastAsia="Calibri" w:hAnsi="Calibri"/>
@@ -93,7 +93,7 @@
         </w:rPr>
         <w:t xml:space="preserve">⁠in </w:t>
       </w:r>
-      <w:hyperlink w:history="1" r:id="rIdbkeduznkanv3mfn_fbnzj">
+      <w:hyperlink w:history="1" r:id="rId6pdzc2ellh7ts1bg9obk1">
         <w:r>
           <w:rPr>
             <w:rFonts w:ascii="Calibri" w:cs="Calibri" w:eastAsia="Calibri" w:hAnsi="Calibri"/>
@@ -123,7 +123,7 @@
         </w:rPr>
         <w:t xml:space="preserve">◔ </w:t>
       </w:r>
-      <w:hyperlink w:history="1" r:id="rIdy6t9tvuvl4jeaaut_eded">
+      <w:hyperlink w:history="1" r:id="rIdvs41pby3c-520ishdgopg">
         <w:r>
           <w:rPr>
             <w:rFonts w:ascii="Calibri" w:cs="Calibri" w:eastAsia="Calibri" w:hAnsi="Calibri"/>
@@ -153,7 +153,7 @@
         </w:rPr>
         <w:t xml:space="preserve">Ⓘ </w:t>
       </w:r>
-      <w:hyperlink w:history="1" r:id="rIdrnl-vwjruczqrg_1b3byd">
+      <w:hyperlink w:history="1" r:id="rIdwii4eseizl-e4f6ewx32z">
         <w:r>
           <w:rPr>
             <w:rFonts w:ascii="Calibri" w:cs="Calibri" w:eastAsia="Calibri" w:hAnsi="Calibri"/>
@@ -716,7 +716,7 @@
         </w:rPr>
         <w:t xml:space="preserve">   </w:t>
       </w:r>
-      <w:hyperlink w:history="1" r:id="rIdlnu4nnreolbngmd7jc2ow">
+      <w:hyperlink w:history="1" r:id="rIdigpys6du7d2wfajwyssz8">
         <w:r>
           <w:rPr>
             <w:rFonts w:ascii="Calibri" w:cs="Calibri" w:eastAsia="Calibri" w:hAnsi="Calibri"/>
@@ -744,7 +744,7 @@
         </w:rPr>
         <w:t xml:space="preserve">| </w:t>
       </w:r>
-      <w:hyperlink w:history="1" r:id="rId_prmewq3lydc-attca19w">
+      <w:hyperlink w:history="1" r:id="rIdywpgaobubwwh1eod2hflx">
         <w:r>
           <w:rPr>
             <w:rFonts w:ascii="Calibri" w:cs="Calibri" w:eastAsia="Calibri" w:hAnsi="Calibri"/>
@@ -772,7 +772,7 @@
         </w:rPr>
         <w:t xml:space="preserve">| </w:t>
       </w:r>
-      <w:hyperlink w:history="1" r:id="rIdnb0stktm6o5sdovrxv7bb">
+      <w:hyperlink w:history="1" r:id="rIdldh0xs0kyehw3nwp0l9da">
         <w:r>
           <w:rPr>
             <w:rFonts w:ascii="Calibri" w:cs="Calibri" w:eastAsia="Calibri" w:hAnsi="Calibri"/>
@@ -1125,7 +1125,7 @@
         </w:rPr>
         <w:t xml:space="preserve">   </w:t>
       </w:r>
-      <w:hyperlink w:history="1" r:id="rId_j7w48iegxrm-fhscu-qw">
+      <w:hyperlink w:history="1" r:id="rIdtlqysc9fh4wouupfriygz">
         <w:r>
           <w:rPr>
             <w:rFonts w:ascii="Calibri" w:cs="Calibri" w:eastAsia="Calibri" w:hAnsi="Calibri"/>
@@ -1275,7 +1275,7 @@
         </w:rPr>
         <w:t xml:space="preserve">   </w:t>
       </w:r>
-      <w:hyperlink w:history="1" r:id="rIdrr-ciaba-c2hkf1fybnoc">
+      <w:hyperlink w:history="1" r:id="rIdtqbdm8hnysa4x62fdcsgo">
         <w:r>
           <w:rPr>
             <w:rFonts w:ascii="Calibri" w:cs="Calibri" w:eastAsia="Calibri" w:hAnsi="Calibri"/>
@@ -1303,7 +1303,7 @@
         </w:rPr>
         <w:t xml:space="preserve">| </w:t>
       </w:r>
-      <w:hyperlink w:history="1" r:id="rIduyqgoiwkjrn6ou0ftgqvf">
+      <w:hyperlink w:history="1" r:id="rIdteyiciiscr4pfhkwde9mi">
         <w:r>
           <w:rPr>
             <w:rFonts w:ascii="Calibri" w:cs="Calibri" w:eastAsia="Calibri" w:hAnsi="Calibri"/>
@@ -1436,7 +1436,7 @@
         </w:rPr>
         <w:t xml:space="preserve">   </w:t>
       </w:r>
-      <w:hyperlink w:history="1" r:id="rIdwastdpzht8w1l05s0xaob">
+      <w:hyperlink w:history="1" r:id="rIdmu-n4bvgzasioonfcdqyj">
         <w:r>
           <w:rPr>
             <w:rFonts w:ascii="Calibri" w:cs="Calibri" w:eastAsia="Calibri" w:hAnsi="Calibri"/>
@@ -1464,7 +1464,7 @@
         </w:rPr>
         <w:t xml:space="preserve">| </w:t>
       </w:r>
-      <w:hyperlink w:history="1" r:id="rIdmqagkwqugvo-hpieoi82v">
+      <w:hyperlink w:history="1" r:id="rIdy_mjso-hzqkqnyquv1-f8">
         <w:r>
           <w:rPr>
             <w:rFonts w:ascii="Calibri" w:cs="Calibri" w:eastAsia="Calibri" w:hAnsi="Calibri"/>
@@ -1492,7 +1492,7 @@
         </w:rPr>
         <w:t xml:space="preserve">| </w:t>
       </w:r>
-      <w:hyperlink w:history="1" r:id="rIdgueaviqkwmfeydedefqox">
+      <w:hyperlink w:history="1" r:id="rIdizkvzevy6a3ha4xqrq1xm">
         <w:r>
           <w:rPr>
             <w:rFonts w:ascii="Calibri" w:cs="Calibri" w:eastAsia="Calibri" w:hAnsi="Calibri"/>
@@ -1659,7 +1659,7 @@
         </w:rPr>
         <w:t xml:space="preserve">   </w:t>
       </w:r>
-      <w:hyperlink w:history="1" r:id="rIdtl9wxv3nvdkzzzuhzzisj">
+      <w:hyperlink w:history="1" r:id="rIdfao-3vtrfgb8hk5bjvgm4">
         <w:r>
           <w:rPr>
             <w:rFonts w:ascii="Calibri" w:cs="Calibri" w:eastAsia="Calibri" w:hAnsi="Calibri"/>
@@ -1828,7 +1828,7 @@
         </w:rPr>
         <w:t xml:space="preserve">   </w:t>
       </w:r>
-      <w:hyperlink w:history="1" r:id="rIdbyc263d6gkk_d4ee4nkak">
+      <w:hyperlink w:history="1" r:id="rIddsm_baqouk6p-mvbeb9uv">
         <w:r>
           <w:rPr>
             <w:rFonts w:ascii="Calibri" w:cs="Calibri" w:eastAsia="Calibri" w:hAnsi="Calibri"/>
@@ -1856,7 +1856,7 @@
         </w:rPr>
         <w:t xml:space="preserve">| </w:t>
       </w:r>
-      <w:hyperlink w:history="1" r:id="rIdmzmt1b6i81urfmp0dhhfp">
+      <w:hyperlink w:history="1" r:id="rIdz4cy_nit4p0sdevbyrscj">
         <w:r>
           <w:rPr>
             <w:rFonts w:ascii="Calibri" w:cs="Calibri" w:eastAsia="Calibri" w:hAnsi="Calibri"/>
@@ -2802,7 +2802,7 @@
         </w:rPr>
         <w:t xml:space="preserve">   </w:t>
       </w:r>
-      <w:hyperlink w:history="1" r:id="rIdelekrjszkirxdjdh8lppt">
+      <w:hyperlink w:history="1" r:id="rId-j2xp-zf1u0kmi8z7iyfn">
         <w:r>
           <w:rPr>
             <w:rFonts w:ascii="Calibri" w:cs="Calibri" w:eastAsia="Calibri" w:hAnsi="Calibri"/>
@@ -2830,7 +2830,7 @@
         </w:rPr>
         <w:t xml:space="preserve">| </w:t>
       </w:r>
-      <w:hyperlink w:history="1" r:id="rId34qoxpi1mferwrbhr-8bj">
+      <w:hyperlink w:history="1" r:id="rIdtf7tazve6n8xzotv5iozu">
         <w:r>
           <w:rPr>
             <w:rFonts w:ascii="Calibri" w:cs="Calibri" w:eastAsia="Calibri" w:hAnsi="Calibri"/>

</xml_diff>